<commit_message>
docs: finalize submission materials and record cross-backend verification
</commit_message>
<xml_diff>
--- a/submission/technical-report.docx
+++ b/submission/technical-report.docx
@@ -74,7 +74,7 @@
     </w:p>
     <w:p>
       <w:r>
-        <w:t>缩减器以原始报告的首个违规代码为目标，反复尝试删除单条事件并复验，直到无法继续删除。输出包含缩减前后事件数、目标违规代码、缩减后的磁带及其检查报告。结果是针对该违规代码的 1-minimal 子序列，不保证全局最短，也不保证保留相同根因。</w:t>
+        <w:t>缩减器默认以原始报告的首个违规代码为目标，也可指定违规代码和调用标识，反复尝试删除单条事件并复验，直到无法继续删除。输出包含缩减前后事件数、目标违规与调用标识、删除的事件标识、缩减磁带及其检查报告。结果是针对该违规代码的 1-minimal 子序列，不保证全局最短，也不保证保留相同根因。</w:t>
       </w:r>
     </w:p>
     <w:p>
@@ -87,7 +87,7 @@
     </w:p>
     <w:p>
       <w:r>
-        <w:t>MoonBit 的 JS 后端导出 evaluate_json 和 minimize_json。Node CLI 读取磁带文件、调用内核并输出 JSON；浏览器使用同一产物，实现示例切换、回放、缩减和报告下载。JavaScript 仅负责输入输出与展示，不重复实现策略规则。</w:t>
+        <w:t>可导入的 MoonBit 核心包位于 src/core，提供 evaluate_json、minimize_json 和 minimize_target_json；JS 绑定位于 src/main.mbt。Node CLI 读取磁带文件、调用内核并输出 JSON；浏览器使用同一产物，实现本地文件导入、示例切换、回放、指定目标缩减和报告下载。JavaScript 仅负责输入输出与展示，不重复实现策略规则。</w:t>
       </w:r>
     </w:p>
     <w:p>
@@ -100,7 +100,7 @@
     </w:p>
     <w:p>
       <w:r>
-        <w:t>12 项核心测试覆盖授权绑定、迟到授权、预算边界、缺失 fixture、结果漂移、工具限制、负成本、重复 ID、schema 错误及确定性。宿主集成测试进一步验证编译导出、12 组预算边界、输入上限和缩减后的单条删除最小性。测试输出保存在 evidence/test_results.txt。</w:t>
+        <w:t>16 项核心测试覆盖授权绑定、迟到授权、预算边界、缺失 fixture、结果漂移、工具限制、负成本、重复 ID、schema 错误及确定性。宿主集成测试进一步验证编译导出、12 组预算边界、输入上限和缩减后的单条删除最小性。另有 64 组固定种子生成磁带和 832 次性质断言、批量回归清单验证、浏览器交互与 JSON Schema 契约检查。测试输出保存在 evidence/test_results.txt。</w:t>
       </w:r>
     </w:p>
     <w:p>

</xml_diff>